<commit_message>
docs(patent): regenerate copyright package to match current project
Update patient/_gen.py so the software-copyright (EHM uchun dastur)
documents reflect the project's current logic, then regenerate:
- Referat: adds Telegram Mini App (React), court-schedule lookup
  (jadval2 «Ishimni tekshirish»), court directory, voice-to-text,
  feedback channel, auto-cleanup; broadens scope to all 4 court types
  / 30+ templates; refreshed tech stack + size.
- Model (source listing): adds the new modules — jadval2/transcription/
  webapp-api/telegram-auth/cleanup services, court-info, and the React
  webapp (App.tsx, api.ts, FieldEditor.tsx).
- Cover page regenerated.

Co-Authored-By: Claude Opus 4.8 (1M context) <noreply@anthropic.com>
</commit_message>
<xml_diff>
--- a/patient/4.Referat_ArizaPro.docx
+++ b/patient/4.Referat_ArizaPro.docx
@@ -109,7 +109,7 @@
           <w:b w:val="0"/>
           <w:i w:val="0"/>
         </w:rPr>
-        <w:t>Ushbu dasturiy ta'minot O'zbekiston Respublikasi fuqarolari uchun sud arizalarini avtomatik tarzda shakllantirish maqsadida ishlab chiqilgan bo'lib, foydalanuvchi Telegram messenjerida bot bilan muloqot qilish orqali aliment undirish, 3 yoshgacha ta'minot ta'minlash, sud buyrug'iga e'tiroz bildirish va aliment miqdorini kamaytirish to'g'risidagi rasmiy ariza loyihasini tayyor PDF holida oladi.</w:t>
+        <w:t>Ushbu dasturiy ta'minot O'zbekiston Respublikasi fuqarolari uchun sud hujjatlarini (arizalar, shikoyatlar, iltimosnomalar va e'tiroznomalar) avtomatik tarzda shakllantirish maqsadida ishlab chiqilgan. Foydalanuvchi Telegram bot yoki Telegram Mini App (web-ilova) orqali savol-javob shaklida ma'lumot kiritadi va to'rt turdagi sud — fuqarolik, jinoyat, ma'muriy hamda iqtisodiy ishlar bo'yicha 30 dan ortiq tayyor andoza asosida rasmiy hujjat loyihasini tayyor PDF yoki DOCX holida oladi.</w:t>
       </w:r>
     </w:p>
     <w:p>
@@ -121,7 +121,7 @@
           <w:b w:val="0"/>
           <w:i w:val="0"/>
         </w:rPr>
-        <w:t>Dasturning qo'llanilish sohasi — fuqarolik-huquqiy munosabatlar doirasidagi sud hujjatlarini elektron tarzda tayyorlash. Avvallari fuqarolar bunday hujjatlarni mustaqil tuza olmas, advokat yoki yuristga murojaat qilishga majbur edilar. ArizaPro buni 60 soniyaga qisqartiradi va xarajatni o'n barobardan ko'p kamaytiradi. Asosiy iste'molchilar — past va o'rta daromadli fuqarolar, mehnat migrantlari, yagona ona-otalar.</w:t>
+        <w:t>Dasturning qo'llanilish sohasi — sud-huquqiy munosabatlar doirasidagi hujjatlarni elektron tarzda tayyorlash va sud jarayoni to'g'risidagi ma'lumotlarga ommaviy kirishni ta'minlash. Avvallari fuqarolar bunday hujjatlarni mustaqil tuza olmas, advokat yoki yuristga murojaat qilishga majbur edilar. ArizaPro buni bir necha daqiqaga qisqartiradi va xarajatni o'n barobardan ko'p kamaytiradi. Asosiy iste'molchilar — past va o'rta daromadli fuqarolar, mehnat migrantlari, yagona ota-onalar, shuningdek tadbirkorlik subyektlari.</w:t>
       </w:r>
     </w:p>
     <w:p>
@@ -145,7 +145,7 @@
           <w:b w:val="0"/>
           <w:i w:val="0"/>
         </w:rPr>
-        <w:t>— foydalanuvchidan kerakli ma'lumotlarni bosqichma-bosqich (savol-javob shaklida) yig'ish; har bir maydon real vaqtda tasdiqlanadi (FISH, telefon raqami, sana, manzil, pul summasi va shu kabilar);</w:t>
+        <w:t>— foydalanuvchidan kerakli ma'lumotlarni bosqichma-bosqich (savol-javob shaklida) yig'ish; har bir maydon real vaqtda tasdiqlanadi (FISH, telefon raqami, sana, manzil, pul summasi, STIR/JSHSHIR va shu kabilar); shartli maydonlar oldingi javoblarga qarab ko'rsatiladi yoki yashiriladi;</w:t>
       </w:r>
     </w:p>
     <w:p>
@@ -157,7 +157,43 @@
           <w:b w:val="0"/>
           <w:i w:val="0"/>
         </w:rPr>
-        <w:t>— Telegram profilining ma'lumotlari asosida F.I.SH.ni avtomatik to'ldirish, shuningdek hujjat tilini foydalanuvchining til afzalligiga qarab tanlash (o'zbek kirill, o'zbek lotin yoki rus tilida);</w:t>
+        <w:t>— bot bilan bir xil funksionalga ega zamonaviy Telegram Mini App (React asosidagi web-ilova): kim xohlasa bot orqali, kim xohlasa grafik interfeys orqali ishlaydi; initData HMAC-imzosi orqali foydalanuvchi autentifikatsiyasi amalga oshiriladi;</w:t>
+      </w:r>
+    </w:p>
+    <w:p>
+      <w:pPr>
+        <w:spacing w:after="160"/>
+      </w:pPr>
+      <w:r>
+        <w:rPr>
+          <w:b w:val="0"/>
+          <w:i w:val="0"/>
+        </w:rPr>
+        <w:t>— jadval2.sud.uz axborot tizimi bilan integratsiya: sud majlislariga tayinlangan ishlar ro'yxatini hudud va sud kesimida (jinoyat ishlari hamda ma'muriy huquqbuzarliklar bo'yicha) ko'rish va F.I.SH. yoki ish raqami bo'yicha qidirish ("Ishimni tekshirish");</w:t>
+      </w:r>
+    </w:p>
+    <w:p>
+      <w:pPr>
+        <w:spacing w:after="160"/>
+      </w:pPr>
+      <w:r>
+        <w:rPr>
+          <w:b w:val="0"/>
+          <w:i w:val="0"/>
+        </w:rPr>
+        <w:t>— O'zbekiston sudlari bo'yicha ma'lumotnoma: har bir sudning yuridik manzili, telefon raqami, elektron pochtasi va xaritadagi joylashuvi ("Sudlar ma'lumoti");</w:t>
+      </w:r>
+    </w:p>
+    <w:p>
+      <w:pPr>
+        <w:spacing w:after="160"/>
+      </w:pPr>
+      <w:r>
+        <w:rPr>
+          <w:b w:val="0"/>
+          <w:i w:val="0"/>
+        </w:rPr>
+        <w:t>— Telegram profilining ma'lumotlari asosida F.I.SH.ni avtomatik to'ldirish, tanlangan sud va hududga qarab sud nomi va sudya ma'lumotlarini avtomatik kiritish; hujjat tilini foydalanuvchining til afzalligiga qarab tanlash (o'zbek kirill, o'zbek lotin yoki rus tilida);</w:t>
       </w:r>
     </w:p>
     <w:p>
@@ -181,6 +217,30 @@
           <w:b w:val="0"/>
           <w:i w:val="0"/>
         </w:rPr>
+        <w:t>— erkin matnli maydonlarni ovozli xabar orqali to'ldirish: ovoz matnga aylantiriladi (Whisper/Groq nutqni tanish xizmati);</w:t>
+      </w:r>
+    </w:p>
+    <w:p>
+      <w:pPr>
+        <w:spacing w:after="160"/>
+      </w:pPr>
+      <w:r>
+        <w:rPr>
+          <w:b w:val="0"/>
+          <w:i w:val="0"/>
+        </w:rPr>
+        <w:t>— sun'iy intellekt yordamida foydalanuvchining erkin matnli javoblarini (masalan, e'tiroz sabablarini) rasmiy-yuridik uslubda qayta yozish (Anthropic Claude API integratsiyasi);</w:t>
+      </w:r>
+    </w:p>
+    <w:p>
+      <w:pPr>
+        <w:spacing w:after="160"/>
+      </w:pPr>
+      <w:r>
+        <w:rPr>
+          <w:b w:val="0"/>
+          <w:i w:val="0"/>
+        </w:rPr>
         <w:t>— Click UZ va Payme (Paycom) to'lov tizimlari bilan integratsiya: har bir tayyor hujjat uchun belgilangan summada to'lov qabul qilish (JSON-RPC, MD5 imzo tekshiruvi, webhook orqali ma'lumotni qaytarish);</w:t>
       </w:r>
     </w:p>
@@ -193,7 +253,7 @@
           <w:b w:val="0"/>
           <w:i w:val="0"/>
         </w:rPr>
-        <w:t>— Telegram chati orqali QR-kod va deep-link orqali hujjatni qayta yuklab olish imkoniyati (har bir hujjatga noyob downloadToken biriktiriladi);</w:t>
+        <w:t>— Telegram chati orqali QR-kod va deep-link orqali hujjatni qayta yuklab olish imkoniyati (har bir hujjatga noyob downloadToken biriktiriladi; eskirgan fayllar avtomatik tozalanib turiladi);</w:t>
       </w:r>
     </w:p>
     <w:p>
@@ -205,7 +265,7 @@
           <w:b w:val="0"/>
           <w:i w:val="0"/>
         </w:rPr>
-        <w:t>— sun'iy intellekt yordamida foydalanuvchining erkin matnli javoblarini (masalan, e'tiroz sabablarini) rasmiy-yuridik uslubda qayta yozish (Anthropic Claude API integratsiyasi);</w:t>
+        <w:t>— foydalanuvchilardan arizalar tuzilishi yuzasidan takliflar va shikoyatlarni qabul qilib, ularni xizmat ko'rsatuvchi guruhga yo'naltirish;</w:t>
       </w:r>
     </w:p>
     <w:p>
@@ -241,7 +301,7 @@
           <w:b w:val="0"/>
           <w:i w:val="0"/>
         </w:rPr>
-        <w:t>Dastur Node.js 20 platformasi, TypeScript dasturlash tili va Telegraf freymvorki asosida ishlab chiqilgan. Ma'lumotlar bazasi sifatida PostgreSQL 17 va Prisma ORM ishlatiladi. Hujjat shakllantirish uchun docxtemplater + PizZip, PDF konvertatsiyasi uchun LibreOffice headless rejimi qo'llaniladi. Foydalanuvchi interfeysi 3 tilda: o'zbek (kirill va lotin) va rus tilida.</w:t>
+        <w:t>Dastur server qismi Node.js 20 platformasi, TypeScript dasturlash tili va Telegraf freymvorki asosida ishlab chiqilgan. Telegram Mini App (web-ilova) React 19, Vite va Tailwind CSS asosida tuzilgan. Ma'lumotlar bazasi sifatida PostgreSQL 17 va Prisma ORM ishlatiladi. Hujjat shakllantirish uchun docxtemplater + PizZip, PDF konvertatsiyasi uchun LibreOffice headless rejimi qo'llaniladi. Foydalanuvchi interfeysi 3 tilda: o'zbek (kirill va lotin) va rus tilida.</w:t>
       </w:r>
     </w:p>
     <w:p>
@@ -276,7 +336,7 @@
           <w:b w:val="0"/>
           <w:i w:val="0"/>
         </w:rPr>
-        <w:t>Dastur tili: TypeScript 5 (Node.js 20 LTS platformasi)</w:t>
+        <w:t>Dastur tili: TypeScript 5 (server — Node.js 20 LTS; web-ilova — React 19)</w:t>
       </w:r>
     </w:p>
     <w:p>
@@ -288,7 +348,19 @@
           <w:b w:val="0"/>
           <w:i w:val="0"/>
         </w:rPr>
-        <w:t>Ishlatilgan kutubxonalar: Telegraf 4.16, Prisma 5, docxtemplater, PizZip, ExcelJS, Sharp, libphonenumber-js, Pino, Zod, @anthropic-ai/sdk</w:t>
+        <w:t>Server kutubxonalari: Telegraf 4.16, Prisma 5, docxtemplater, PizZip, ExcelJS, Sharp, qrcode, libphonenumber-js, Pino, Zod, @anthropic-ai/sdk</w:t>
+      </w:r>
+    </w:p>
+    <w:p>
+      <w:pPr>
+        <w:spacing w:after="120"/>
+      </w:pPr>
+      <w:r>
+        <w:rPr>
+          <w:b w:val="0"/>
+          <w:i w:val="0"/>
+        </w:rPr>
+        <w:t>Telegram Mini App (web-ilova): React 19, Vite 6, Tailwind CSS 4, React Router 7</w:t>
       </w:r>
     </w:p>
     <w:p>
@@ -301,6 +373,18 @@
           <w:i w:val="0"/>
         </w:rPr>
         <w:t>Ma'lumotlar bazasi: PostgreSQL 17</w:t>
+      </w:r>
+    </w:p>
+    <w:p>
+      <w:pPr>
+        <w:spacing w:after="120"/>
+      </w:pPr>
+      <w:r>
+        <w:rPr>
+          <w:b w:val="0"/>
+          <w:i w:val="0"/>
+        </w:rPr>
+        <w:t>Tashqi xizmatlar va integratsiyalar: jadval2.sud.uz (sud majlislari jadvali), Click UZ va Payme to'lov tizimlari, Anthropic Claude API (matnni qayta yozish), Whisper/Groq (nutqni matnga aylantirish)</w:t>
       </w:r>
     </w:p>
     <w:p>
@@ -336,7 +420,7 @@
           <w:b w:val="0"/>
           <w:i w:val="0"/>
         </w:rPr>
-        <w:t>Dastur hajmi (kompilyatsiyadan oldingi manba kod): ~350 KB (~12 000 satr)</w:t>
+        <w:t>Dastur hajmi (kompilyatsiyadan oldingi manba kod): ~700 KB (~20 000 satr)</w:t>
       </w:r>
     </w:p>
     <w:sectPr>

</xml_diff>